<commit_message>
docs(qa): update delivery 1 documents for group 7
</commit_message>
<xml_diff>
--- a/qa/entrega-1/Plan_de_Pruebas_PanelOrganizador_CIN421.docx
+++ b/qa/entrega-1/Plan_de_Pruebas_PanelOrganizador_CIN421.docx
@@ -60,34 +60,9 @@
       <w:r>
         <w:rPr>
           <w:b/>
-          <w:color w:val="C9A227"/>
           <w:sz w:val="28"/>
         </w:rPr>
-        <w:t xml:space="preserve">Proyecto TicketU · Entrega 1 · </w:t>
-      </w:r>
-      <w:r>
-        <w:rPr>
-          <w:b/>
-          <w:color w:val="C9A227"/>
-          <w:sz w:val="28"/>
-        </w:rPr>
-        <w:t>Panel Organizador</w:t>
-      </w:r>
-      <w:r>
-        <w:rPr>
-          <w:b/>
-          <w:color w:val="C9A227"/>
-          <w:sz w:val="28"/>
-        </w:rPr>
-        <w:t xml:space="preserve"> · </w:t>
-      </w:r>
-      <w:r>
-        <w:rPr>
-          <w:b/>
-          <w:color w:val="C9A227"/>
-          <w:sz w:val="28"/>
-        </w:rPr>
-        <w:t>Grupo 1</w:t>
+        <w:t>Proyecto TicketU · Entrega 1 · Panel Organizador · Grupo 7</w:t>
       </w:r>
     </w:p>
     <w:p>
@@ -194,7 +169,8 @@
               <w:spacing w:after="0"/>
             </w:pPr>
             <w:r>
-              <w:t>Grupo QA del Panel Organizador</w:t>
+              <w:rPr/>
+              <w:t>Grupo 7 · QA del Panel Organizador (microservicio 7)</w:t>
             </w:r>
           </w:p>
         </w:tc>
@@ -12086,7 +12062,7 @@
             </w:pPr>
             <w:r>
               <w:rPr/>
-              <w:t>Valores límite</w:t>
+              <w:t>Transición de estados</w:t>
             </w:r>
           </w:p>
         </w:tc>
@@ -12101,7 +12077,7 @@
             </w:pPr>
             <w:r>
               <w:rPr/>
-              <w:t>2</w:t>
+              <w:t>4</w:t>
             </w:r>
           </w:p>
         </w:tc>
@@ -12116,7 +12092,7 @@
             </w:pPr>
             <w:r>
               <w:rPr/>
-              <w:t>3</w:t>
+              <w:t>1</w:t>
             </w:r>
           </w:p>
         </w:tc>
@@ -12151,7 +12127,7 @@
             </w:pPr>
             <w:r>
               <w:rPr/>
-              <w:t>Transición de estados</w:t>
+              <w:t>Valores límite</w:t>
             </w:r>
           </w:p>
         </w:tc>
@@ -12165,7 +12141,7 @@
             </w:pPr>
             <w:r>
               <w:rPr/>
-              <w:t>4</w:t>
+              <w:t>2</w:t>
             </w:r>
           </w:p>
         </w:tc>
@@ -12179,7 +12155,7 @@
             </w:pPr>
             <w:r>
               <w:rPr/>
-              <w:t>1</w:t>
+              <w:t>3</w:t>
             </w:r>
           </w:p>
         </w:tc>
@@ -12461,7 +12437,21 @@
             </w:pPr>
             <w:r>
               <w:rPr/>
-              <w:t>Regresión automatizada</w:t>
+              <w:t>Caja blanca (cobertura)</w:t>
+            </w:r>
+          </w:p>
+        </w:tc>
+        <w:tc>
+          <w:tcPr>
+            <w:tcW w:w="1984" w:type="dxa"/>
+          </w:tcPr>
+          <w:p>
+            <w:pPr>
+              <w:spacing w:after="0"/>
+            </w:pPr>
+            <w:r>
+              <w:rPr/>
+              <w:t>0</w:t>
             </w:r>
           </w:p>
         </w:tc>
@@ -12476,20 +12466,6 @@
             <w:r>
               <w:rPr/>
               <w:t>1</w:t>
-            </w:r>
-          </w:p>
-        </w:tc>
-        <w:tc>
-          <w:tcPr>
-            <w:tcW w:w="1984" w:type="dxa"/>
-          </w:tcPr>
-          <w:p>
-            <w:pPr>
-              <w:spacing w:after="0"/>
-            </w:pPr>
-            <w:r>
-              <w:rPr/>
-              <w:t>0</w:t>
             </w:r>
           </w:p>
         </w:tc>
@@ -12523,7 +12499,21 @@
             </w:pPr>
             <w:r>
               <w:rPr/>
-              <w:t>Caja blanca (cobertura)</w:t>
+              <w:t>Regresión automatizada</w:t>
+            </w:r>
+          </w:p>
+        </w:tc>
+        <w:tc>
+          <w:tcPr>
+            <w:tcW w:w="1984" w:type="dxa"/>
+          </w:tcPr>
+          <w:p>
+            <w:pPr>
+              <w:spacing w:after="0"/>
+            </w:pPr>
+            <w:r>
+              <w:rPr/>
+              <w:t>1</w:t>
             </w:r>
           </w:p>
         </w:tc>
@@ -12538,20 +12528,6 @@
             <w:r>
               <w:rPr/>
               <w:t>0</w:t>
-            </w:r>
-          </w:p>
-        </w:tc>
-        <w:tc>
-          <w:tcPr>
-            <w:tcW w:w="1984" w:type="dxa"/>
-          </w:tcPr>
-          <w:p>
-            <w:pPr>
-              <w:spacing w:after="0"/>
-            </w:pPr>
-            <w:r>
-              <w:rPr/>
-              <w:t>1</w:t>
             </w:r>
           </w:p>
         </w:tc>

</xml_diff>